<commit_message>
upgrade AI chat and deep reports
</commit_message>
<xml_diff>
--- a/artifacts/CyberShield35-Thuyet-minh-san-pham-AI-for-Life-2026.docx
+++ b/artifacts/CyberShield35-Thuyet-minh-san-pham-AI-for-Life-2026.docx
@@ -1636,7 +1636,7 @@
                 <w:b w:val="0"/>
                 <w:sz w:val="18"/>
               </w:rPr>
-              <w:t>Bằng chứng, phân tích, chủ đề, cảnh báo, bản nháp, bài viết Zalo OA, báo cáo Word/PDF và bản đọc tiếng Việt.</w:t>
+              <w:t>Bằng chứng, phân tích, chủ đề, cảnh báo, bản nháp, bài viết Zalo OA, báo cáo AI chuyên sâu, Word/PDF và bản đọc tiếng Việt.</w:t>
             </w:r>
           </w:p>
         </w:tc>
@@ -2506,7 +2506,7 @@
         <w:t xml:space="preserve">Một hệ thống, nhiều đầu ra: </w:t>
       </w:r>
       <w:r>
-        <w:t>cùng một nội dung có thể phục vụ duyệt nội bộ, bài Zalo, báo cáo hoặc bản đọc âm thanh.</w:t>
+        <w:t>cùng một tập bằng chứng có thể phục vụ duyệt nội bộ, bài Zalo, báo cáo chuyên sâu hoặc bản đọc âm thanh.</w:t>
       </w:r>
     </w:p>
     <w:p>
@@ -3213,7 +3213,7 @@
                 <w:b w:val="0"/>
                 <w:sz w:val="18"/>
               </w:rPr>
-              <w:t>Trả lời có dẫn nguồn; công cụ tạo scan/bản nháp cần phê duyệt.</w:t>
+              <w:t>Tự điều chỉnh độ sâu theo yêu cầu; tách dữ kiện, diễn giải, điểm chưa rõ và bước tiếp theo.</w:t>
             </w:r>
           </w:p>
         </w:tc>
@@ -3272,7 +3272,7 @@
                 <w:b w:val="0"/>
                 <w:sz w:val="18"/>
               </w:rPr>
-              <w:t>Preset báo cáo, bằng chứng trọng yếu, Word/PDF và bản đọc tiếng Việt có thể tải về.</w:t>
+              <w:t>Chọn scan và mẫu, tự tạo bản chuyên sâu, xem trước rồi tải Word/PDF hoặc bản đọc tiếng Việt.</w:t>
             </w:r>
           </w:p>
         </w:tc>
@@ -3299,7 +3299,7 @@
                 <w:b w:val="0"/>
                 <w:sz w:val="18"/>
               </w:rPr>
-              <w:t>Tổng hợp có căn cứ và chuyển văn bản thành giọng đọc qua hạ tầng AI dùng chung.</w:t>
+              <w:t>Đối chiếu bằng chứng, viết tóm tắt điều hành, phát hiện, khuyến nghị ưu tiên, giới hạn và lưu ý biên tập.</w:t>
             </w:r>
           </w:p>
         </w:tc>
@@ -3382,6 +3382,70 @@
         <w:spacing w:after="0"/>
       </w:pPr>
     </w:p>
+    <w:tbl>
+      <w:tblPr>
+        <w:tblW w:type="auto" w:w="0"/>
+        <w:tblLayout w:type="fixed"/>
+        <w:tblLook w:firstColumn="1" w:firstRow="1" w:lastColumn="0" w:lastRow="0" w:noHBand="0" w:noVBand="1" w:val="04A0"/>
+      </w:tblPr>
+      <w:tblGrid>
+        <w:gridCol w:w="102"/>
+        <w:gridCol w:w="8957"/>
+      </w:tblGrid>
+      <w:tr>
+        <w:trPr>
+          <w:cantSplit/>
+        </w:trPr>
+        <w:tc>
+          <w:tcPr>
+            <w:tcW w:type="dxa" w:w="4824"/>
+            <w:shd w:fill="176B87"/>
+          </w:tcPr>
+          <w:p/>
+        </w:tc>
+        <w:tc>
+          <w:tcPr>
+            <w:tcW w:type="dxa" w:w="4824"/>
+            <w:shd w:fill="EAF4F6"/>
+            <w:tcMar>
+              <w:top w:w="140" w:type="dxa"/>
+              <w:start w:w="180" w:type="dxa"/>
+              <w:bottom w:w="140" w:type="dxa"/>
+              <w:end w:w="180" w:type="dxa"/>
+            </w:tcMar>
+          </w:tcPr>
+          <w:p>
+            <w:pPr>
+              <w:spacing w:after="60"/>
+            </w:pPr>
+            <w:r>
+              <w:rPr>
+                <w:b/>
+                <w:color w:val="12344A"/>
+                <w:sz w:val="20"/>
+              </w:rPr>
+              <w:t>Báo cáo AI chuyên sâu, không chỉ ghép mẫu</w:t>
+            </w:r>
+          </w:p>
+          <w:p>
+            <w:pPr>
+              <w:spacing w:after="0" w:line="276" w:lineRule="auto"/>
+            </w:pPr>
+            <w:r>
+              <w:rPr>
+                <w:sz w:val="19"/>
+              </w:rPr>
+              <w:t>Khi mở bản xem trước, hệ thống dùng phiên AI của workspace để đọc scan, phân tích, bằng chứng và bản nháp liên quan. Chế độ “Chuyên sâu” phát triển từng mục theo dữ liệu thực có, chỉ ra phát hiện, hệ quả, khuyến nghị ưu tiên và giới hạn; nếu AI tạm thời không khả dụng, bản tổng hợp có cấu trúc vẫn sẵn sàng để xem và xuất.</w:t>
+            </w:r>
+          </w:p>
+        </w:tc>
+      </w:tr>
+    </w:tbl>
+    <w:p>
+      <w:pPr>
+        <w:spacing w:after="0"/>
+      </w:pPr>
+    </w:p>
     <w:p>
       <w:pPr>
         <w:pStyle w:val="ListBullet"/>
@@ -3422,6 +3486,20 @@
       </w:r>
       <w:r>
         <w:t>trích yếu Zalo được rút gọn theo giới hạn ký tự và không lặp nguyên tiêu đề; bộ lọc làm sạch ký tự không tương thích.</w:t>
+      </w:r>
+    </w:p>
+    <w:p>
+      <w:pPr>
+        <w:pStyle w:val="ListBullet"/>
+      </w:pPr>
+      <w:r>
+        <w:rPr>
+          <w:b/>
+        </w:rPr>
+        <w:t xml:space="preserve">Khoảng cách Zalo ổn định: </w:t>
+      </w:r>
+      <w:r>
+        <w:t>bộ chuẩn hóa coi xuống dòng có chủ ý là ranh giới đoạn, bỏ tiêu đề dẫn trùng và ngăn hiện tượng tiêu đề phụ dính vào câu kế tiếp trong bảng xem trước OA.</w:t>
       </w:r>
     </w:p>
     <w:p>
@@ -3818,7 +3896,7 @@
                 <w:b w:val="0"/>
                 <w:sz w:val="18"/>
               </w:rPr>
-              <w:t>Không yêu cầu người dùng nhập khóa; lựa chọn model được máy chủ cho phép.</w:t>
+              <w:t>Không yêu cầu người dùng nhập khóa; hỗ trợ đầu ra có cấu trúc, giới hạn model và ngân sách đầu ra theo tác vụ.</w:t>
             </w:r>
           </w:p>
         </w:tc>
@@ -4232,7 +4310,7 @@
         <w:t xml:space="preserve">4. </w:t>
       </w:r>
       <w:r>
-        <w:t>AI nhận phần ngữ cảnh tối thiểu cần thiết, tạo kết quả có cấu trúc và được làm sạch trước khi lưu.</w:t>
+        <w:t>AI nhận ngữ cảnh phù hợp với tác vụ, tạo kết quả có cấu trúc và được làm sạch trước khi lưu; báo cáo chuyên sâu có ngân sách đầu ra lớn hơn nhưng không kéo dài bằng nội dung rỗng.</w:t>
       </w:r>
     </w:p>
     <w:p>
@@ -5362,7 +5440,7 @@
                 <w:b w:val="0"/>
                 <w:sz w:val="18"/>
               </w:rPr>
-              <w:t>Mức sẵn sàng, bằng chứng trọng yếu, preset và giải thích chỉ số.</w:t>
+              <w:t>Tạo tự động từ scan, hai mức độ phân tích, tóm tắt điều hành, phát hiện, khuyến nghị, giới hạn và xuất đa định dạng.</w:t>
             </w:r>
           </w:p>
         </w:tc>
@@ -5472,7 +5550,7 @@
         <w:pStyle w:val="ListBullet"/>
       </w:pPr>
       <w:r>
-        <w:t>Unit test cho schema, làm sạch tiếng Việt, logic rủi ro, retry ngữ cảnh, PKCE, mã hóa token, payload Zalo, xuất tệp và quyền công cụ.</w:t>
+        <w:t>Unit test cho schema báo cáo, làm sạch tiếng Việt, phân tách đoạn Zalo, logic rủi ro, retry ngữ cảnh, PKCE, mã hóa token, payload Zalo, xuất tệp và quyền công cụ.</w:t>
       </w:r>
     </w:p>
     <w:p>
@@ -6527,7 +6605,7 @@
         <w:t xml:space="preserve">AI suy diễn hoặc viết thiếu tự nhiên: </w:t>
       </w:r>
       <w:r>
-        <w:t>chỉ dùng bằng chứng, schema đầu ra, hướng dẫn tiếng Việt tập trung, phiên bản và duyệt bắt buộc.</w:t>
+        <w:t>chỉ dùng bằng chứng, schema đầu ra, hướng dẫn tiếng Việt tập trung, nêu giới hạn, phiên bản và duyệt bắt buộc.</w:t>
       </w:r>
     </w:p>
     <w:p>
@@ -7997,7 +8075,7 @@
                 <w:b w:val="0"/>
                 <w:sz w:val="18"/>
               </w:rPr>
-              <w:t>5:10–6:00</w:t>
+              <w:t>5:10–6:15</w:t>
             </w:r>
           </w:p>
         </w:tc>
@@ -8024,7 +8102,7 @@
                 <w:b w:val="0"/>
                 <w:sz w:val="18"/>
               </w:rPr>
-              <w:t>Xuất Word/PDF/âm thanh và mở Báo cáo.</w:t>
+              <w:t>Mở Báo cáo, xem AI tự soạn bản chuyên sâu rồi xuất Word/PDF/âm thanh.</w:t>
             </w:r>
           </w:p>
         </w:tc>
@@ -8051,7 +8129,7 @@
                 <w:b w:val="0"/>
                 <w:sz w:val="18"/>
               </w:rPr>
-              <w:t>Một nguồn nội dung phục vụ nhiều đầu ra, có thể tải về.</w:t>
+              <w:t>Báo cáo phân biệt phát hiện, khuyến nghị và giới hạn; vẫn có bản tổng hợp dự phòng.</w:t>
             </w:r>
           </w:p>
         </w:tc>
@@ -8082,7 +8160,7 @@
                 <w:b w:val="0"/>
                 <w:sz w:val="18"/>
               </w:rPr>
-              <w:t>6:00–6:30</w:t>
+              <w:t>6:15–6:45</w:t>
             </w:r>
           </w:p>
         </w:tc>

</xml_diff>

<commit_message>
docs: refine Vietnamese competition proposal
</commit_message>
<xml_diff>
--- a/artifacts/CyberShield35-Thuyet-minh-san-pham-AI-for-Life-2026.docx
+++ b/artifacts/CyberShield35-Thuyet-minh-san-pham-AI-for-Life-2026.docx
@@ -27,9 +27,9 @@
           <w:color w:val="12344A"/>
           <w:sz w:val="34"/>
         </w:rPr>
-        <w:t>Nền tảng AI hỗ trợ giám sát thông tin, kiểm chứng bằng chứng</w:t>
+        <w:t>Giúp đội ngũ theo dõi thông tin, kiểm tra bằng chứng</w:t>
         <w:br/>
-        <w:t>và biên tập nội dung có trách nhiệm</w:t>
+        <w:t>và chuẩn bị nội dung tiếng Việt đáng tin cậy</w:t>
       </w:r>
     </w:p>
     <w:tbl>
@@ -508,7 +508,7 @@
               <w:rPr>
                 <w:sz w:val="19"/>
               </w:rPr>
-              <w:t>Biến dòng thông tin rời rạc thành quy trình có bằng chứng: thu thập → phân tích → biên tập → duyệt → phân phối an toàn. AI hỗ trợ con người ra quyết định, không tự ý xuất bản.</w:t>
+              <w:t>CyberShield35 đưa nguồn tin, bằng chứng, phân tích và nội dung cần duyệt vào cùng một quy trình. AI giúp làm nhanh những việc tốn thời gian; con người vẫn là người kiểm tra, biên tập và quyết định có công bố hay không.</w:t>
             </w:r>
           </w:p>
         </w:tc>
@@ -1259,7 +1259,7 @@
               <w:rPr>
                 <w:sz w:val="19"/>
               </w:rPr>
-              <w:t>Ban giám khảo có thể bắt đầu từ Mục III để nắm mô hình giải pháp, Mục IV để xem chức năng trọng tâm và Mục VII để đối chiếu mức độ hoàn thiện.</w:t>
+              <w:t>Để nắm sản phẩm trong vài phút, Ban Giám khảo có thể xem Mục III về cách giải pháp vận hành, Mục IV về các chức năng chính và Mục VII về mức độ hoàn thiện, kiểm thử.</w:t>
             </w:r>
           </w:p>
         </w:tc>
@@ -1579,7 +1579,7 @@
                 <w:b w:val="0"/>
                 <w:sz w:val="18"/>
               </w:rPr>
-              <w:t>Facebook, website, văn bản nhập tay và tệp tài liệu; kiến trúc nhà cung cấp có thể mở rộng.</w:t>
+              <w:t>Facebook, website, nội dung nhập trực tiếp và tệp tài liệu; có thể bổ sung nguồn thu thập mới khi cần.</w:t>
             </w:r>
           </w:p>
         </w:tc>
@@ -1724,7 +1724,7 @@
     </w:p>
     <w:p>
       <w:r>
-        <w:t>Thông tin trên mạng xã hội có tốc độ lan truyền cao nhưng phân tán theo nhiều nguồn, nhiều định dạng và nhiều ngữ cảnh. Nhân sự phải mở từng đường dẫn, chép nội dung, đối chiếu ảnh và tự tổng hợp trước khi có thể đưa ra nhận định. Quy trình thủ công này tốn thời gian, khó truy vết và dễ bỏ sót căn cứ.</w:t>
+        <w:t>Tin bài trên mạng xã hội lan nhanh nhưng thường nằm rải rác ở nhiều nguồn, nhiều định dạng và thiếu ngữ cảnh đầy đủ. Để đánh giá một nội dung, nhân sự phải mở từng đường dẫn, chép lại thông tin, đối chiếu hình ảnh rồi tự tổng hợp. Cách làm này vừa mất thời gian, vừa khó lần lại căn cứ khi cần kiểm tra hoặc bàn giao.</w:t>
       </w:r>
     </w:p>
     <w:p>
@@ -1738,7 +1738,7 @@
         <w:t xml:space="preserve">Khối lượng lớn: </w:t>
       </w:r>
       <w:r>
-        <w:t>nhiều bài đăng và lượt quét xuất hiện đồng thời, gây quá tải cho người theo dõi.</w:t>
+        <w:t>nhiều bài đăng có thể xuất hiện cùng lúc, khiến người theo dõi khó biết nội dung nào cần xử lý trước.</w:t>
       </w:r>
     </w:p>
     <w:p>
@@ -1794,7 +1794,7 @@
         <w:t xml:space="preserve">Dữ liệu rời rạc: </w:t>
       </w:r>
       <w:r>
-        <w:t>scan, bằng chứng, người phụ trách, phiên bản chỉnh sửa và báo cáo không nằm trong cùng một luồng công việc.</w:t>
+        <w:t>lần quét, bằng chứng, người phụ trách, các bản sửa và báo cáo thường nằm ở nhiều nơi, khó phối hợp.</w:t>
       </w:r>
     </w:p>
     <w:p>
@@ -1890,7 +1890,62 @@
     </w:p>
     <w:p>
       <w:r>
-        <w:t>CyberShield35 là không gian tác nghiệp web dành cho đội ngũ theo dõi và xử lý thông tin số. Hệ thống kết hợp thu thập đa nguồn, lưu bằng chứng, phân tích AI, biên tập tiếng Việt có kiểm soát và tích hợp Zalo OA. Điểm khác biệt không nằm ở việc “AI viết thay”, mà ở quy trình buộc AI phải dựa trên bằng chứng và đặt con người vào các điểm quyết định.</w:t>
+        <w:t>CyberShield35 là không gian làm việc trên web dành cho đội ngũ theo dõi và xử lý thông tin số. Từ một đường dẫn hoặc tệp đầu vào, hệ thống giúp thu thập nội dung, giữ lại bằng chứng, phân tích dấu hiệu cần chú ý, chuẩn bị bản nháp tiếng Việt và chuyển bài sang Zalo OA ở trạng thái chưa công khai. Giá trị cốt lõi không phải là để AI “viết thay”, mà là giúp con người làm việc nhanh hơn mà vẫn nhìn thấy nguồn, lý do và quyền kiểm soát ở từng bước.</w:t>
+      </w:r>
+    </w:p>
+    <w:p>
+      <w:pPr>
+        <w:keepLines/>
+        <w:spacing w:before="100" w:after="60"/>
+        <w:jc w:val="center"/>
+      </w:pPr>
+      <w:r>
+        <w:drawing>
+          <wp:inline xmlns:a="http://schemas.openxmlformats.org/drawingml/2006/main" xmlns:pic="http://schemas.openxmlformats.org/drawingml/2006/picture">
+            <wp:extent cx="5688000" cy="3286400"/>
+            <wp:docPr id="1" name="Picture 1"/>
+            <wp:cNvGraphicFramePr>
+              <a:graphicFrameLocks noChangeAspect="1"/>
+            </wp:cNvGraphicFramePr>
+            <a:graphic>
+              <a:graphicData uri="http://schemas.openxmlformats.org/drawingml/2006/picture">
+                <pic:pic>
+                  <pic:nvPicPr>
+                    <pic:cNvPr id="0" name="architecture.png"/>
+                    <pic:cNvPicPr/>
+                  </pic:nvPicPr>
+                  <pic:blipFill>
+                    <a:blip r:embed="rId11"/>
+                    <a:stretch>
+                      <a:fillRect/>
+                    </a:stretch>
+                  </pic:blipFill>
+                  <pic:spPr>
+                    <a:xfrm>
+                      <a:off x="0" y="0"/>
+                      <a:ext cx="5688000" cy="3286400"/>
+                    </a:xfrm>
+                    <a:prstGeom prst="rect"/>
+                  </pic:spPr>
+                </pic:pic>
+              </a:graphicData>
+            </a:graphic>
+          </wp:inline>
+        </w:drawing>
+      </w:r>
+    </w:p>
+    <w:p>
+      <w:pPr>
+        <w:spacing w:after="160"/>
+        <w:jc w:val="center"/>
+      </w:pPr>
+      <w:r>
+        <w:rPr>
+          <w:i/>
+          <w:color w:val="526471"/>
+          <w:sz w:val="17"/>
+        </w:rPr>
+        <w:t>Hình 1. Kiến trúc tổng thể: mọi đầu ra đều đi qua lớp bằng chứng, biên tập và phê duyệt.</w:t>
       </w:r>
     </w:p>
     <w:p>
@@ -2056,7 +2111,7 @@
                 <w:b w:val="0"/>
                 <w:sz w:val="18"/>
               </w:rPr>
-              <w:t>Tạo scan ngay hoặc xếp hàng; theo dõi nguồn định kỳ.</w:t>
+              <w:t>Tạo lần quét ngay hoặc đưa vào hàng đợi; theo dõi nguồn định kỳ.</w:t>
             </w:r>
           </w:p>
         </w:tc>
@@ -2082,7 +2137,7 @@
                 <w:b w:val="0"/>
                 <w:sz w:val="18"/>
               </w:rPr>
-              <w:t>Một công việc có mã, trạng thái, tiến độ và nhà cung cấp.</w:t>
+              <w:t>Một công việc có mã, trạng thái, tiến độ và dịch vụ xử lý.</w:t>
             </w:r>
           </w:p>
         </w:tc>
@@ -2433,6 +2488,61 @@
     </w:p>
     <w:p>
       <w:pPr>
+        <w:keepLines/>
+        <w:spacing w:before="100" w:after="60"/>
+        <w:jc w:val="center"/>
+      </w:pPr>
+      <w:r>
+        <w:drawing>
+          <wp:inline xmlns:a="http://schemas.openxmlformats.org/drawingml/2006/main" xmlns:pic="http://schemas.openxmlformats.org/drawingml/2006/picture">
+            <wp:extent cx="5616000" cy="2371200"/>
+            <wp:docPr id="2" name="Picture 2"/>
+            <wp:cNvGraphicFramePr>
+              <a:graphicFrameLocks noChangeAspect="1"/>
+            </wp:cNvGraphicFramePr>
+            <a:graphic>
+              <a:graphicData uri="http://schemas.openxmlformats.org/drawingml/2006/picture">
+                <pic:pic>
+                  <pic:nvPicPr>
+                    <pic:cNvPr id="0" name="workflow.png"/>
+                    <pic:cNvPicPr/>
+                  </pic:nvPicPr>
+                  <pic:blipFill>
+                    <a:blip r:embed="rId12"/>
+                    <a:stretch>
+                      <a:fillRect/>
+                    </a:stretch>
+                  </pic:blipFill>
+                  <pic:spPr>
+                    <a:xfrm>
+                      <a:off x="0" y="0"/>
+                      <a:ext cx="5616000" cy="2371200"/>
+                    </a:xfrm>
+                    <a:prstGeom prst="rect"/>
+                  </pic:spPr>
+                </pic:pic>
+              </a:graphicData>
+            </a:graphic>
+          </wp:inline>
+        </w:drawing>
+      </w:r>
+    </w:p>
+    <w:p>
+      <w:pPr>
+        <w:spacing w:after="160"/>
+        <w:jc w:val="center"/>
+      </w:pPr>
+      <w:r>
+        <w:rPr>
+          <w:i/>
+          <w:color w:val="526471"/>
+          <w:sz w:val="17"/>
+        </w:rPr>
+        <w:t>Hình 2. Luồng tác nghiệp 5 bước và điểm chặn an toàn trước khi công bố.</w:t>
+      </w:r>
+    </w:p>
+    <w:p>
+      <w:pPr>
         <w:pStyle w:val="Heading2"/>
       </w:pPr>
       <w:r>
@@ -2447,10 +2557,10 @@
         <w:rPr>
           <w:b/>
         </w:rPr>
-        <w:t xml:space="preserve">Evidence-first: </w:t>
+        <w:t xml:space="preserve">Lấy bằng chứng làm điểm xuất phát: </w:t>
       </w:r>
       <w:r>
-        <w:t>bằng chứng là đối tượng dữ liệu độc lập, không phải đoạn văn bị chôn trong báo cáo.</w:t>
+        <w:t>mỗi trích đoạn, hình ảnh và đường dẫn được lưu riêng, có thể mở lại để kiểm tra thay vì bị chôn trong một bản báo cáo dài.</w:t>
       </w:r>
     </w:p>
     <w:p>
@@ -2461,10 +2571,10 @@
         <w:rPr>
           <w:b/>
         </w:rPr>
-        <w:t xml:space="preserve">Human-in-the-loop thực chất: </w:t>
+        <w:t xml:space="preserve">Con người giữ quyền quyết định: </w:t>
       </w:r>
       <w:r>
-        <w:t>trạng thái cần duyệt, lịch sử phiên bản và xác nhận xuất bản được tách khỏi thao tác AI.</w:t>
+        <w:t>trạng thái cần duyệt, lịch sử các lần sửa và xác nhận xuất bản được tách khỏi thao tác của AI.</w:t>
       </w:r>
     </w:p>
     <w:p>
@@ -2706,7 +2816,7 @@
                 <w:b w:val="0"/>
                 <w:sz w:val="18"/>
               </w:rPr>
-              <w:t>Chọn và chuẩn hóa pipeline phù hợp với loại nguồn.</w:t>
+              <w:t>Nhận diện loại nguồn và chọn quy trình thu thập phù hợp.</w:t>
             </w:r>
           </w:p>
         </w:tc>
@@ -2961,7 +3071,7 @@
                 <w:b w:val="0"/>
                 <w:sz w:val="18"/>
               </w:rPr>
-              <w:t>Viết và viết lại dựa trên bằng chứng, không chèn [1], không bịa thêm dữ kiện.</w:t>
+              <w:t>Viết và viết lại dựa trên bằng chứng, không chèn ký hiệu trích dẫn thô và không bịa thêm dữ kiện.</w:t>
             </w:r>
           </w:p>
         </w:tc>
@@ -3130,7 +3240,7 @@
                 <w:b w:val="0"/>
                 <w:sz w:val="18"/>
               </w:rPr>
-              <w:t>Chuẩn bị payload đúng giới hạn; AI không được tự xuất bản.</w:t>
+              <w:t>Chuẩn bị dữ liệu đúng giới hạn của Zalo; AI không được tự xuất bản.</w:t>
             </w:r>
           </w:p>
         </w:tc>
@@ -3161,7 +3271,7 @@
                 <w:b w:val="0"/>
                 <w:sz w:val="18"/>
               </w:rPr>
-              <w:t>Chat có ngữ cảnh</w:t>
+              <w:t>Trò chuyện có ngữ cảnh</w:t>
             </w:r>
           </w:p>
         </w:tc>
@@ -3187,7 +3297,7 @@
                 <w:b w:val="0"/>
                 <w:sz w:val="18"/>
               </w:rPr>
-              <w:t>Hội thoại lưu bền với scan, bằng chứng, chủ đề, bản nháp và bài viết được ghim.</w:t>
+              <w:t>Hội thoại được lưu cùng lần quét, bằng chứng, chủ đề, bản nháp và bài viết đã ghim.</w:t>
             </w:r>
           </w:p>
         </w:tc>
@@ -3272,7 +3382,7 @@
                 <w:b w:val="0"/>
                 <w:sz w:val="18"/>
               </w:rPr>
-              <w:t>Chọn scan và mẫu, tự tạo bản chuyên sâu, xem trước rồi tải Word/PDF hoặc bản đọc tiếng Việt.</w:t>
+              <w:t>Chọn lần quét và mẫu, tự tạo bản chuyên sâu, xem trước rồi tải Word/PDF hoặc bản đọc tiếng Việt.</w:t>
             </w:r>
           </w:p>
         </w:tc>
@@ -3309,6 +3419,61 @@
       <w:pPr>
         <w:spacing w:after="0"/>
       </w:pPr>
+    </w:p>
+    <w:p>
+      <w:pPr>
+        <w:keepLines/>
+        <w:spacing w:before="100" w:after="60"/>
+        <w:jc w:val="center"/>
+      </w:pPr>
+      <w:r>
+        <w:drawing>
+          <wp:inline xmlns:a="http://schemas.openxmlformats.org/drawingml/2006/main" xmlns:pic="http://schemas.openxmlformats.org/drawingml/2006/picture">
+            <wp:extent cx="5616000" cy="2558400"/>
+            <wp:docPr id="3" name="Picture 3"/>
+            <wp:cNvGraphicFramePr>
+              <a:graphicFrameLocks noChangeAspect="1"/>
+            </wp:cNvGraphicFramePr>
+            <a:graphic>
+              <a:graphicData uri="http://schemas.openxmlformats.org/drawingml/2006/picture">
+                <pic:pic>
+                  <pic:nvPicPr>
+                    <pic:cNvPr id="0" name="capabilities.png"/>
+                    <pic:cNvPicPr/>
+                  </pic:nvPicPr>
+                  <pic:blipFill>
+                    <a:blip r:embed="rId13"/>
+                    <a:stretch>
+                      <a:fillRect/>
+                    </a:stretch>
+                  </pic:blipFill>
+                  <pic:spPr>
+                    <a:xfrm>
+                      <a:off x="0" y="0"/>
+                      <a:ext cx="5616000" cy="2558400"/>
+                    </a:xfrm>
+                    <a:prstGeom prst="rect"/>
+                  </pic:spPr>
+                </pic:pic>
+              </a:graphicData>
+            </a:graphic>
+          </wp:inline>
+        </w:drawing>
+      </w:r>
+    </w:p>
+    <w:p>
+      <w:pPr>
+        <w:spacing w:after="160"/>
+        <w:jc w:val="center"/>
+      </w:pPr>
+      <w:r>
+        <w:rPr>
+          <w:i/>
+          <w:color w:val="526471"/>
+          <w:sz w:val="17"/>
+        </w:rPr>
+        <w:t>Hình 3. Mười nhóm chức năng chính trải đều từ thu thập đến vận hành; đây là bản đồ phạm vi, không phải chỉ số hiệu năng.</w:t>
+      </w:r>
     </w:p>
     <w:p>
       <w:pPr>
@@ -3435,7 +3600,7 @@
               <w:rPr>
                 <w:sz w:val="19"/>
               </w:rPr>
-              <w:t>Khi mở bản xem trước, hệ thống dùng phiên AI của workspace để đọc scan, phân tích, bằng chứng và bản nháp liên quan. Chế độ “Chuyên sâu” phát triển từng mục theo dữ liệu thực có, chỉ ra phát hiện, hệ quả, khuyến nghị ưu tiên và giới hạn; nếu AI tạm thời không khả dụng, bản tổng hợp có cấu trúc vẫn sẵn sàng để xem và xuất.</w:t>
+              <w:t>Khi mở bản xem trước, hệ thống dùng phiên AI của không gian làm việc để đọc lần quét, kết quả phân tích, bằng chứng và bản nháp liên quan. Chế độ “Chuyên sâu” phát triển từng mục theo dữ liệu thực có, chỉ ra phát hiện, hệ quả, khuyến nghị ưu tiên và giới hạn. Nếu AI tạm thời không khả dụng, người dùng vẫn có một bản tổng hợp có cấu trúc để xem và xuất.</w:t>
             </w:r>
           </w:p>
         </w:tc>
@@ -3457,7 +3622,7 @@
         <w:t xml:space="preserve">Tự động tạo bản nháp theo từng nguồn: </w:t>
       </w:r>
       <w:r>
-        <w:t>quy tắc fanpage xác định đáng tin cậy, có rủi ro hoặc trung lập; tùy chọn tự động tạo bản nháp cần duyệt được lưu và hiển thị trạng thái rõ.</w:t>
+        <w:t>mỗi trang có thể được xếp là đáng tin cậy, có rủi ro hoặc trung lập. Người dùng chủ động bật chế độ tự tạo bản nháp cần duyệt và luôn nhìn thấy tác động của lựa chọn này.</w:t>
       </w:r>
     </w:p>
     <w:p>
@@ -3513,7 +3678,7 @@
         <w:t xml:space="preserve">Đối soát Zalo tự động: </w:t>
       </w:r>
       <w:r>
-        <w:t>mã thao tác được lưu ngay; kết quả không chắc chắn được đối chiếu với danh sách bài từ OA trước khi thử lại để tránh tạo trùng.</w:t>
+        <w:t>mã thao tác được lưu ngay. Nếu kết nối bị ngắt giữa chừng, hệ thống kiểm tra lại danh sách bài của OA trước khi thử lại để tránh tạo trùng.</w:t>
       </w:r>
     </w:p>
     <w:p>
@@ -3524,10 +3689,10 @@
         <w:rPr>
           <w:b/>
         </w:rPr>
-        <w:t xml:space="preserve">UX theo trạng thái: </w:t>
+        <w:t xml:space="preserve">Giao diện giải thích ngay tại chỗ: </w:t>
       </w:r>
       <w:r>
-        <w:t>badge, tooltip, bộ lọc gọn, bảng/tabs và thanh bên thu gọn giúp người dùng hiểu tác động trước khi thao tác.</w:t>
+        <w:t>nhãn trạng thái, chú thích khi rê chuột, bộ lọc gọn, thẻ nội dung và thanh bên thu gọn giúp người dùng hiểu tác động trước khi thao tác.</w:t>
       </w:r>
     </w:p>
     <w:p>
@@ -3543,7 +3708,20 @@
         <w:pStyle w:val="Heading2"/>
       </w:pPr>
       <w:r>
-        <w:t>5.1. Kiến trúc kỹ thuật</w:t>
+        <w:t>5.1. Kiến trúc hệ thống</w:t>
+      </w:r>
+    </w:p>
+    <w:p>
+      <w:r>
+        <w:t>Hệ thống được chia thành các lớp có trách nhiệm rõ ràng. Lớp thu thập tiếp nhận nguồn tin và điều phối công việc chạy nền. Lớp dữ liệu giữ nguyên nội dung, hình ảnh và nguồn gốc để mọi phân tích có thể kiểm tra lại. Lớp AI chỉ nhận phần ngữ cảnh cần thiết cho từng tác vụ. Lớp biên tập quản lý phiên bản và phê duyệt, còn lớp tích hợp tạo đầu ra chưa công khai hoặc tệp tải xuống. Cách chia này giúp thay đổi một nhà cung cấp mà không làm xáo trộn toàn bộ quy trình.</w:t>
+      </w:r>
+    </w:p>
+    <w:p>
+      <w:pPr>
+        <w:pStyle w:val="Heading2"/>
+      </w:pPr>
+      <w:r>
+        <w:t>5.2. Ngăn xếp công nghệ</w:t>
       </w:r>
     </w:p>
     <w:tbl>
@@ -3813,7 +3991,7 @@
                 <w:b w:val="0"/>
                 <w:sz w:val="18"/>
               </w:rPr>
-              <w:t>Lưu dữ liệu có cấu trúc, phiên bản, audit; kiểm tra payload ở biên API.</w:t>
+              <w:t>Lưu dữ liệu có cấu trúc, phiên bản và nhật ký; kiểm tra dữ liệu ngay tại ranh giới API.</w:t>
             </w:r>
           </w:p>
         </w:tc>
@@ -3870,7 +4048,7 @@
                 <w:b w:val="0"/>
                 <w:sz w:val="18"/>
               </w:rPr>
-              <w:t>Tuturuuu external-app AI; Gemini qua hợp đồng OpenAI-compatible</w:t>
+              <w:t>Hạ tầng AI Tuturuuu dành cho ứng dụng liên kết; Google Gemini</w:t>
             </w:r>
           </w:p>
         </w:tc>
@@ -3896,7 +4074,7 @@
                 <w:b w:val="0"/>
                 <w:sz w:val="18"/>
               </w:rPr>
-              <w:t>Không yêu cầu người dùng nhập khóa; hỗ trợ đầu ra có cấu trúc, giới hạn model và ngân sách đầu ra theo tác vụ.</w:t>
+              <w:t>Người dùng không cần tự nhập khóa; hệ thống chọn mô hình đã được cho phép và giới hạn lượng nội dung theo từng tác vụ.</w:t>
             </w:r>
           </w:p>
         </w:tc>
@@ -3955,7 +4133,7 @@
                 <w:b w:val="0"/>
                 <w:sz w:val="18"/>
               </w:rPr>
-              <w:t>Apify, Firecrawl, Browser-use và bộ chọn nhà cung cấp</w:t>
+              <w:t>Apify, Firecrawl, Browser-use và bộ điều phối nguồn</w:t>
             </w:r>
           </w:p>
         </w:tc>
@@ -3982,7 +4160,7 @@
                 <w:b w:val="0"/>
                 <w:sz w:val="18"/>
               </w:rPr>
-              <w:t>Thu thập theo loại nguồn, ghi provider run và lỗi có thể khôi phục.</w:t>
+              <w:t>Chọn cách thu thập phù hợp, lưu lịch sử từng lần chạy và cho phép khôi phục khi có lỗi.</w:t>
             </w:r>
           </w:p>
         </w:tc>
@@ -4208,7 +4386,7 @@
                 <w:b w:val="0"/>
                 <w:sz w:val="18"/>
               </w:rPr>
-              <w:t>Worker hàng đợi, cron 5 phút, khóa hàng và retry hữu hạn</w:t>
+              <w:t>Tiến trình xử lý hàng đợi, lịch chạy 5 phút, khóa bản ghi và số lần thử lại có giới hạn</w:t>
             </w:r>
           </w:p>
         </w:tc>
@@ -4234,7 +4412,7 @@
                 <w:b w:val="0"/>
                 <w:sz w:val="18"/>
               </w:rPr>
-              <w:t>Xử lý nền, tránh trùng và cung cấp quan sát trạng thái.</w:t>
+              <w:t>Xử lý tác vụ dài ở nền, tránh trùng và cho phép theo dõi trạng thái.</w:t>
             </w:r>
           </w:p>
         </w:tc>
@@ -4250,7 +4428,7 @@
         <w:pStyle w:val="Heading2"/>
       </w:pPr>
       <w:r>
-        <w:t>5.2. Luồng dữ liệu</w:t>
+        <w:t>5.3. Luồng dữ liệu</w:t>
       </w:r>
     </w:p>
     <w:p>
@@ -4265,7 +4443,7 @@
         <w:t xml:space="preserve">1. </w:t>
       </w:r>
       <w:r>
-        <w:t>Đầu vào được phát hiện loại nguồn và chuẩn hóa trước khi ghi công việc scan.</w:t>
+        <w:t>Hệ thống nhận diện loại nguồn và chuẩn hóa đầu vào trước khi tạo một công việc quét.</w:t>
       </w:r>
     </w:p>
     <w:p>
@@ -4280,7 +4458,7 @@
         <w:t xml:space="preserve">2. </w:t>
       </w:r>
       <w:r>
-        <w:t>Worker thu thập nội dung; mỗi lần gọi nhà cung cấp tạo một provider run và sự kiện tiến độ.</w:t>
+        <w:t>Tiến trình chạy nền thu thập nội dung; mỗi lần gọi dịch vụ đều có lịch sử và sự kiện tiến độ riêng.</w:t>
       </w:r>
     </w:p>
     <w:p>
@@ -4325,7 +4503,7 @@
         <w:t xml:space="preserve">5. </w:t>
       </w:r>
       <w:r>
-        <w:t>Người dùng sửa, duyệt và chọn đầu ra; mỗi thay đổi quan trọng tạo phiên bản hoặc audit event.</w:t>
+        <w:t>Người dùng sửa, duyệt và chọn đầu ra; mỗi thay đổi quan trọng tạo một phiên bản hoặc bản ghi nhật ký.</w:t>
       </w:r>
     </w:p>
     <w:p>
@@ -4342,6 +4520,635 @@
       <w:r>
         <w:t>Đồng bộ Zalo tạo bài ở trạng thái không công khai; xuất bản cần hành động xác nhận riêng.</w:t>
       </w:r>
+    </w:p>
+    <w:p>
+      <w:pPr>
+        <w:pStyle w:val="Heading2"/>
+      </w:pPr>
+      <w:r>
+        <w:t>5.4. Các quyết định kiến trúc chủ chốt</w:t>
+      </w:r>
+    </w:p>
+    <w:p>
+      <w:r>
+        <w:t>Những lựa chọn dưới đây được đưa ra để cân bằng ba yêu cầu: dễ kiểm tra, vận hành ổn định và không để tự động hóa vượt quá quyền của người dùng.</w:t>
+      </w:r>
+    </w:p>
+    <w:tbl>
+      <w:tblPr>
+        <w:tblStyle w:val="TableGrid"/>
+        <w:tblW w:type="auto" w:w="0"/>
+        <w:jc w:val="center"/>
+        <w:tblLayout w:type="fixed"/>
+        <w:tblLook w:firstColumn="1" w:firstRow="1" w:lastColumn="0" w:lastRow="0" w:noHBand="0" w:noVBand="1" w:val="04A0"/>
+      </w:tblPr>
+      <w:tblGrid>
+        <w:gridCol w:w="3216"/>
+        <w:gridCol w:w="3216"/>
+        <w:gridCol w:w="3216"/>
+      </w:tblGrid>
+      <w:tr>
+        <w:trPr>
+          <w:tblHeader w:val="true"/>
+          <w:cantSplit/>
+        </w:trPr>
+        <w:tc>
+          <w:tcPr>
+            <w:tcW w:type="dxa" w:w="2438"/>
+            <w:vAlign w:val="center"/>
+            <w:tcMar>
+              <w:top w:w="80" w:type="dxa"/>
+              <w:start w:w="120" w:type="dxa"/>
+              <w:bottom w:w="80" w:type="dxa"/>
+              <w:end w:w="120" w:type="dxa"/>
+            </w:tcMar>
+            <w:shd w:fill="176B87"/>
+          </w:tcPr>
+          <w:p>
+            <w:pPr>
+              <w:spacing w:after="0" w:line="264" w:lineRule="auto"/>
+            </w:pPr>
+            <w:r/>
+            <w:r>
+              <w:rPr>
+                <w:rFonts w:ascii="Calibri" w:hAnsi="Calibri"/>
+                <w:b/>
+                <w:color w:val="FFFFFF"/>
+                <w:sz w:val="19"/>
+              </w:rPr>
+              <w:t>Quyết định</w:t>
+            </w:r>
+          </w:p>
+        </w:tc>
+        <w:tc>
+          <w:tcPr>
+            <w:tcW w:type="dxa" w:w="3798"/>
+            <w:vAlign w:val="center"/>
+            <w:tcMar>
+              <w:top w:w="80" w:type="dxa"/>
+              <w:start w:w="120" w:type="dxa"/>
+              <w:bottom w:w="80" w:type="dxa"/>
+              <w:end w:w="120" w:type="dxa"/>
+            </w:tcMar>
+            <w:shd w:fill="176B87"/>
+          </w:tcPr>
+          <w:p>
+            <w:pPr>
+              <w:spacing w:after="0" w:line="264" w:lineRule="auto"/>
+            </w:pPr>
+            <w:r/>
+            <w:r>
+              <w:rPr>
+                <w:rFonts w:ascii="Calibri" w:hAnsi="Calibri"/>
+                <w:b/>
+                <w:color w:val="FFFFFF"/>
+                <w:sz w:val="19"/>
+              </w:rPr>
+              <w:t>Lý do lựa chọn</w:t>
+            </w:r>
+          </w:p>
+        </w:tc>
+        <w:tc>
+          <w:tcPr>
+            <w:tcW w:type="dxa" w:w="2835"/>
+            <w:vAlign w:val="center"/>
+            <w:tcMar>
+              <w:top w:w="80" w:type="dxa"/>
+              <w:start w:w="120" w:type="dxa"/>
+              <w:bottom w:w="80" w:type="dxa"/>
+              <w:end w:w="120" w:type="dxa"/>
+            </w:tcMar>
+            <w:shd w:fill="176B87"/>
+          </w:tcPr>
+          <w:p>
+            <w:pPr>
+              <w:spacing w:after="0" w:line="264" w:lineRule="auto"/>
+            </w:pPr>
+            <w:r/>
+            <w:r>
+              <w:rPr>
+                <w:rFonts w:ascii="Calibri" w:hAnsi="Calibri"/>
+                <w:b/>
+                <w:color w:val="FFFFFF"/>
+                <w:sz w:val="19"/>
+              </w:rPr>
+              <w:t>Đánh đổi được chấp nhận</w:t>
+            </w:r>
+          </w:p>
+        </w:tc>
+      </w:tr>
+      <w:tr>
+        <w:trPr>
+          <w:cantSplit/>
+        </w:trPr>
+        <w:tc>
+          <w:tcPr>
+            <w:tcW w:type="dxa" w:w="2438"/>
+            <w:vAlign w:val="center"/>
+            <w:tcMar>
+              <w:top w:w="80" w:type="dxa"/>
+              <w:start w:w="120" w:type="dxa"/>
+              <w:bottom w:w="80" w:type="dxa"/>
+              <w:end w:w="120" w:type="dxa"/>
+            </w:tcMar>
+          </w:tcPr>
+          <w:p>
+            <w:pPr>
+              <w:spacing w:after="0" w:line="264" w:lineRule="auto"/>
+            </w:pPr>
+            <w:r/>
+            <w:r>
+              <w:rPr>
+                <w:rFonts w:ascii="Calibri" w:hAnsi="Calibri"/>
+                <w:b w:val="0"/>
+                <w:sz w:val="18"/>
+              </w:rPr>
+              <w:t>Lưu bằng chứng như dữ liệu độc lập</w:t>
+            </w:r>
+          </w:p>
+        </w:tc>
+        <w:tc>
+          <w:tcPr>
+            <w:tcW w:type="dxa" w:w="3798"/>
+            <w:vAlign w:val="center"/>
+            <w:tcMar>
+              <w:top w:w="80" w:type="dxa"/>
+              <w:start w:w="120" w:type="dxa"/>
+              <w:bottom w:w="80" w:type="dxa"/>
+              <w:end w:w="120" w:type="dxa"/>
+            </w:tcMar>
+          </w:tcPr>
+          <w:p>
+            <w:pPr>
+              <w:spacing w:after="0" w:line="264" w:lineRule="auto"/>
+            </w:pPr>
+            <w:r/>
+            <w:r>
+              <w:rPr>
+                <w:rFonts w:ascii="Calibri" w:hAnsi="Calibri"/>
+                <w:b w:val="0"/>
+                <w:sz w:val="18"/>
+              </w:rPr>
+              <w:t>Giúp lần lại nguồn, tái sử dụng cho nhiều bản nháp và kiểm tra mọi nhận định.</w:t>
+            </w:r>
+          </w:p>
+        </w:tc>
+        <w:tc>
+          <w:tcPr>
+            <w:tcW w:type="dxa" w:w="2835"/>
+            <w:vAlign w:val="center"/>
+            <w:tcMar>
+              <w:top w:w="80" w:type="dxa"/>
+              <w:start w:w="120" w:type="dxa"/>
+              <w:bottom w:w="80" w:type="dxa"/>
+              <w:end w:w="120" w:type="dxa"/>
+            </w:tcMar>
+          </w:tcPr>
+          <w:p>
+            <w:pPr>
+              <w:spacing w:after="0" w:line="264" w:lineRule="auto"/>
+            </w:pPr>
+            <w:r/>
+            <w:r>
+              <w:rPr>
+                <w:rFonts w:ascii="Calibri" w:hAnsi="Calibri"/>
+                <w:b w:val="0"/>
+                <w:sz w:val="18"/>
+              </w:rPr>
+              <w:t>Cần nhiều quan hệ dữ liệu và thông tin mô tả hơn.</w:t>
+            </w:r>
+          </w:p>
+        </w:tc>
+      </w:tr>
+      <w:tr>
+        <w:trPr>
+          <w:cantSplit/>
+        </w:trPr>
+        <w:tc>
+          <w:tcPr>
+            <w:tcW w:type="dxa" w:w="2438"/>
+            <w:vAlign w:val="center"/>
+            <w:tcMar>
+              <w:top w:w="80" w:type="dxa"/>
+              <w:start w:w="120" w:type="dxa"/>
+              <w:bottom w:w="80" w:type="dxa"/>
+              <w:end w:w="120" w:type="dxa"/>
+            </w:tcMar>
+            <w:shd w:fill="F5F8FA"/>
+          </w:tcPr>
+          <w:p>
+            <w:pPr>
+              <w:spacing w:after="0" w:line="264" w:lineRule="auto"/>
+            </w:pPr>
+            <w:r/>
+            <w:r>
+              <w:rPr>
+                <w:rFonts w:ascii="Calibri" w:hAnsi="Calibri"/>
+                <w:b w:val="0"/>
+                <w:sz w:val="18"/>
+              </w:rPr>
+              <w:t>Xử lý quét và đồng bộ bằng hàng đợi</w:t>
+            </w:r>
+          </w:p>
+        </w:tc>
+        <w:tc>
+          <w:tcPr>
+            <w:tcW w:type="dxa" w:w="3798"/>
+            <w:vAlign w:val="center"/>
+            <w:tcMar>
+              <w:top w:w="80" w:type="dxa"/>
+              <w:start w:w="120" w:type="dxa"/>
+              <w:bottom w:w="80" w:type="dxa"/>
+              <w:end w:w="120" w:type="dxa"/>
+            </w:tcMar>
+            <w:shd w:fill="F5F8FA"/>
+          </w:tcPr>
+          <w:p>
+            <w:pPr>
+              <w:spacing w:after="0" w:line="264" w:lineRule="auto"/>
+            </w:pPr>
+            <w:r/>
+            <w:r>
+              <w:rPr>
+                <w:rFonts w:ascii="Calibri" w:hAnsi="Calibri"/>
+                <w:b w:val="0"/>
+                <w:sz w:val="18"/>
+              </w:rPr>
+              <w:t>Tác vụ dài không làm trình duyệt chờ; có thể tiếp tục sau khi mất kết nối.</w:t>
+            </w:r>
+          </w:p>
+        </w:tc>
+        <w:tc>
+          <w:tcPr>
+            <w:tcW w:type="dxa" w:w="2835"/>
+            <w:vAlign w:val="center"/>
+            <w:tcMar>
+              <w:top w:w="80" w:type="dxa"/>
+              <w:start w:w="120" w:type="dxa"/>
+              <w:bottom w:w="80" w:type="dxa"/>
+              <w:end w:w="120" w:type="dxa"/>
+            </w:tcMar>
+            <w:shd w:fill="F5F8FA"/>
+          </w:tcPr>
+          <w:p>
+            <w:pPr>
+              <w:spacing w:after="0" w:line="264" w:lineRule="auto"/>
+            </w:pPr>
+            <w:r/>
+            <w:r>
+              <w:rPr>
+                <w:rFonts w:ascii="Calibri" w:hAnsi="Calibri"/>
+                <w:b w:val="0"/>
+                <w:sz w:val="18"/>
+              </w:rPr>
+              <w:t>Phải có màn hình theo dõi và cơ chế thử lại có kiểm soát.</w:t>
+            </w:r>
+          </w:p>
+        </w:tc>
+      </w:tr>
+      <w:tr>
+        <w:trPr>
+          <w:cantSplit/>
+        </w:trPr>
+        <w:tc>
+          <w:tcPr>
+            <w:tcW w:type="dxa" w:w="2438"/>
+            <w:vAlign w:val="center"/>
+            <w:tcMar>
+              <w:top w:w="80" w:type="dxa"/>
+              <w:start w:w="120" w:type="dxa"/>
+              <w:bottom w:w="80" w:type="dxa"/>
+              <w:end w:w="120" w:type="dxa"/>
+            </w:tcMar>
+          </w:tcPr>
+          <w:p>
+            <w:pPr>
+              <w:spacing w:after="0" w:line="264" w:lineRule="auto"/>
+            </w:pPr>
+            <w:r/>
+            <w:r>
+              <w:rPr>
+                <w:rFonts w:ascii="Calibri" w:hAnsi="Calibri"/>
+                <w:b w:val="0"/>
+                <w:sz w:val="18"/>
+              </w:rPr>
+              <w:t>Tách trạng thái duyệt khỏi trạng thái Zalo</w:t>
+            </w:r>
+          </w:p>
+        </w:tc>
+        <w:tc>
+          <w:tcPr>
+            <w:tcW w:type="dxa" w:w="3798"/>
+            <w:vAlign w:val="center"/>
+            <w:tcMar>
+              <w:top w:w="80" w:type="dxa"/>
+              <w:start w:w="120" w:type="dxa"/>
+              <w:bottom w:w="80" w:type="dxa"/>
+              <w:end w:w="120" w:type="dxa"/>
+            </w:tcMar>
+          </w:tcPr>
+          <w:p>
+            <w:pPr>
+              <w:spacing w:after="0" w:line="264" w:lineRule="auto"/>
+            </w:pPr>
+            <w:r/>
+            <w:r>
+              <w:rPr>
+                <w:rFonts w:ascii="Calibri" w:hAnsi="Calibri"/>
+                <w:b w:val="0"/>
+                <w:sz w:val="18"/>
+              </w:rPr>
+              <w:t>Một bài được duyệt nội bộ chưa đồng nghĩa với việc được phép công bố.</w:t>
+            </w:r>
+          </w:p>
+        </w:tc>
+        <w:tc>
+          <w:tcPr>
+            <w:tcW w:type="dxa" w:w="2835"/>
+            <w:vAlign w:val="center"/>
+            <w:tcMar>
+              <w:top w:w="80" w:type="dxa"/>
+              <w:start w:w="120" w:type="dxa"/>
+              <w:bottom w:w="80" w:type="dxa"/>
+              <w:end w:w="120" w:type="dxa"/>
+            </w:tcMar>
+          </w:tcPr>
+          <w:p>
+            <w:pPr>
+              <w:spacing w:after="0" w:line="264" w:lineRule="auto"/>
+            </w:pPr>
+            <w:r/>
+            <w:r>
+              <w:rPr>
+                <w:rFonts w:ascii="Calibri" w:hAnsi="Calibri"/>
+                <w:b w:val="0"/>
+                <w:sz w:val="18"/>
+              </w:rPr>
+              <w:t>Quy trình có thêm bước nhưng giảm đáng kể nguy cơ đăng nhầm.</w:t>
+            </w:r>
+          </w:p>
+        </w:tc>
+      </w:tr>
+      <w:tr>
+        <w:trPr>
+          <w:cantSplit/>
+        </w:trPr>
+        <w:tc>
+          <w:tcPr>
+            <w:tcW w:type="dxa" w:w="2438"/>
+            <w:vAlign w:val="center"/>
+            <w:tcMar>
+              <w:top w:w="80" w:type="dxa"/>
+              <w:start w:w="120" w:type="dxa"/>
+              <w:bottom w:w="80" w:type="dxa"/>
+              <w:end w:w="120" w:type="dxa"/>
+            </w:tcMar>
+            <w:shd w:fill="F5F8FA"/>
+          </w:tcPr>
+          <w:p>
+            <w:pPr>
+              <w:spacing w:after="0" w:line="264" w:lineRule="auto"/>
+            </w:pPr>
+            <w:r/>
+            <w:r>
+              <w:rPr>
+                <w:rFonts w:ascii="Calibri" w:hAnsi="Calibri"/>
+                <w:b w:val="0"/>
+                <w:sz w:val="18"/>
+              </w:rPr>
+              <w:t>Dùng hạ tầng AI chung của Tuturuuu</w:t>
+            </w:r>
+          </w:p>
+        </w:tc>
+        <w:tc>
+          <w:tcPr>
+            <w:tcW w:type="dxa" w:w="3798"/>
+            <w:vAlign w:val="center"/>
+            <w:tcMar>
+              <w:top w:w="80" w:type="dxa"/>
+              <w:start w:w="120" w:type="dxa"/>
+              <w:bottom w:w="80" w:type="dxa"/>
+              <w:end w:w="120" w:type="dxa"/>
+            </w:tcMar>
+            <w:shd w:fill="F5F8FA"/>
+          </w:tcPr>
+          <w:p>
+            <w:pPr>
+              <w:spacing w:after="0" w:line="264" w:lineRule="auto"/>
+            </w:pPr>
+            <w:r/>
+            <w:r>
+              <w:rPr>
+                <w:rFonts w:ascii="Calibri" w:hAnsi="Calibri"/>
+                <w:b w:val="0"/>
+                <w:sz w:val="18"/>
+              </w:rPr>
+              <w:t>Tái sử dụng mô hình, bảo mật và kiểm soát truy cập; người dùng không cần khóa riêng.</w:t>
+            </w:r>
+          </w:p>
+        </w:tc>
+        <w:tc>
+          <w:tcPr>
+            <w:tcW w:type="dxa" w:w="2835"/>
+            <w:vAlign w:val="center"/>
+            <w:tcMar>
+              <w:top w:w="80" w:type="dxa"/>
+              <w:start w:w="120" w:type="dxa"/>
+              <w:bottom w:w="80" w:type="dxa"/>
+              <w:end w:w="120" w:type="dxa"/>
+            </w:tcMar>
+            <w:shd w:fill="F5F8FA"/>
+          </w:tcPr>
+          <w:p>
+            <w:pPr>
+              <w:spacing w:after="0" w:line="264" w:lineRule="auto"/>
+            </w:pPr>
+            <w:r/>
+            <w:r>
+              <w:rPr>
+                <w:rFonts w:ascii="Calibri" w:hAnsi="Calibri"/>
+                <w:b w:val="0"/>
+                <w:sz w:val="18"/>
+              </w:rPr>
+              <w:t>Phải tuân theo hợp đồng dịch vụ và danh sách mô hình được cho phép.</w:t>
+            </w:r>
+          </w:p>
+        </w:tc>
+      </w:tr>
+      <w:tr>
+        <w:trPr>
+          <w:cantSplit/>
+        </w:trPr>
+        <w:tc>
+          <w:tcPr>
+            <w:tcW w:type="dxa" w:w="2438"/>
+            <w:vAlign w:val="center"/>
+            <w:tcMar>
+              <w:top w:w="80" w:type="dxa"/>
+              <w:start w:w="120" w:type="dxa"/>
+              <w:bottom w:w="80" w:type="dxa"/>
+              <w:end w:w="120" w:type="dxa"/>
+            </w:tcMar>
+          </w:tcPr>
+          <w:p>
+            <w:pPr>
+              <w:spacing w:after="0" w:line="264" w:lineRule="auto"/>
+            </w:pPr>
+            <w:r/>
+            <w:r>
+              <w:rPr>
+                <w:rFonts w:ascii="Calibri" w:hAnsi="Calibri"/>
+                <w:b w:val="0"/>
+                <w:sz w:val="18"/>
+              </w:rPr>
+              <w:t>Mã hóa và quay vòng token Zalo dưới khóa dữ liệu</w:t>
+            </w:r>
+          </w:p>
+        </w:tc>
+        <w:tc>
+          <w:tcPr>
+            <w:tcW w:type="dxa" w:w="3798"/>
+            <w:vAlign w:val="center"/>
+            <w:tcMar>
+              <w:top w:w="80" w:type="dxa"/>
+              <w:start w:w="120" w:type="dxa"/>
+              <w:bottom w:w="80" w:type="dxa"/>
+              <w:end w:w="120" w:type="dxa"/>
+            </w:tcMar>
+          </w:tcPr>
+          <w:p>
+            <w:pPr>
+              <w:spacing w:after="0" w:line="264" w:lineRule="auto"/>
+            </w:pPr>
+            <w:r/>
+            <w:r>
+              <w:rPr>
+                <w:rFonts w:ascii="Calibri" w:hAnsi="Calibri"/>
+                <w:b w:val="0"/>
+                <w:sz w:val="18"/>
+              </w:rPr>
+              <w:t>Token làm mới chỉ dùng một lần; khóa ngăn hai tiến trình dùng đồng thời.</w:t>
+            </w:r>
+          </w:p>
+        </w:tc>
+        <w:tc>
+          <w:tcPr>
+            <w:tcW w:type="dxa" w:w="2835"/>
+            <w:vAlign w:val="center"/>
+            <w:tcMar>
+              <w:top w:w="80" w:type="dxa"/>
+              <w:start w:w="120" w:type="dxa"/>
+              <w:bottom w:w="80" w:type="dxa"/>
+              <w:end w:w="120" w:type="dxa"/>
+            </w:tcMar>
+          </w:tcPr>
+          <w:p>
+            <w:pPr>
+              <w:spacing w:after="0" w:line="264" w:lineRule="auto"/>
+            </w:pPr>
+            <w:r/>
+            <w:r>
+              <w:rPr>
+                <w:rFonts w:ascii="Calibri" w:hAnsi="Calibri"/>
+                <w:b w:val="0"/>
+                <w:sz w:val="18"/>
+              </w:rPr>
+              <w:t>Luồng kết nối phức tạp hơn và cần theo dõi sức khỏe kết nối.</w:t>
+            </w:r>
+          </w:p>
+        </w:tc>
+      </w:tr>
+      <w:tr>
+        <w:trPr>
+          <w:cantSplit/>
+        </w:trPr>
+        <w:tc>
+          <w:tcPr>
+            <w:tcW w:type="dxa" w:w="2438"/>
+            <w:vAlign w:val="center"/>
+            <w:tcMar>
+              <w:top w:w="80" w:type="dxa"/>
+              <w:start w:w="120" w:type="dxa"/>
+              <w:bottom w:w="80" w:type="dxa"/>
+              <w:end w:w="120" w:type="dxa"/>
+            </w:tcMar>
+            <w:shd w:fill="F5F8FA"/>
+          </w:tcPr>
+          <w:p>
+            <w:pPr>
+              <w:spacing w:after="0" w:line="264" w:lineRule="auto"/>
+            </w:pPr>
+            <w:r/>
+            <w:r>
+              <w:rPr>
+                <w:rFonts w:ascii="Calibri" w:hAnsi="Calibri"/>
+                <w:b w:val="0"/>
+                <w:sz w:val="18"/>
+              </w:rPr>
+              <w:t>Lưu phiên bản và dấu vân tay nội dung</w:t>
+            </w:r>
+          </w:p>
+        </w:tc>
+        <w:tc>
+          <w:tcPr>
+            <w:tcW w:type="dxa" w:w="3798"/>
+            <w:vAlign w:val="center"/>
+            <w:tcMar>
+              <w:top w:w="80" w:type="dxa"/>
+              <w:start w:w="120" w:type="dxa"/>
+              <w:bottom w:w="80" w:type="dxa"/>
+              <w:end w:w="120" w:type="dxa"/>
+            </w:tcMar>
+            <w:shd w:fill="F5F8FA"/>
+          </w:tcPr>
+          <w:p>
+            <w:pPr>
+              <w:spacing w:after="0" w:line="264" w:lineRule="auto"/>
+            </w:pPr>
+            <w:r/>
+            <w:r>
+              <w:rPr>
+                <w:rFonts w:ascii="Calibri" w:hAnsi="Calibri"/>
+                <w:b w:val="0"/>
+                <w:sz w:val="18"/>
+              </w:rPr>
+              <w:t>Phát hiện bài đã thay đổi sau khi đồng bộ hoặc lên lịch, từ đó buộc kiểm tra lại.</w:t>
+            </w:r>
+          </w:p>
+        </w:tc>
+        <w:tc>
+          <w:tcPr>
+            <w:tcW w:type="dxa" w:w="2835"/>
+            <w:vAlign w:val="center"/>
+            <w:tcMar>
+              <w:top w:w="80" w:type="dxa"/>
+              <w:start w:w="120" w:type="dxa"/>
+              <w:bottom w:w="80" w:type="dxa"/>
+              <w:end w:w="120" w:type="dxa"/>
+            </w:tcMar>
+            <w:shd w:fill="F5F8FA"/>
+          </w:tcPr>
+          <w:p>
+            <w:pPr>
+              <w:spacing w:after="0" w:line="264" w:lineRule="auto"/>
+            </w:pPr>
+            <w:r/>
+            <w:r>
+              <w:rPr>
+                <w:rFonts w:ascii="Calibri" w:hAnsi="Calibri"/>
+                <w:b w:val="0"/>
+                <w:sz w:val="18"/>
+              </w:rPr>
+              <w:t>Tốn thêm dung lượng nhưng đổi lại có lịch sử phục hồi và kiểm toán.</w:t>
+            </w:r>
+          </w:p>
+        </w:tc>
+      </w:tr>
+    </w:tbl>
+    <w:p>
+      <w:pPr>
+        <w:spacing w:after="0"/>
+      </w:pPr>
     </w:p>
     <w:p>
       <w:pPr>
@@ -4509,7 +5316,7 @@
                 <w:b w:val="0"/>
                 <w:sz w:val="18"/>
               </w:rPr>
-              <w:t>Phạm vi workspace</w:t>
+              <w:t>Phạm vi không gian làm việc</w:t>
             </w:r>
           </w:p>
         </w:tc>
@@ -4536,7 +5343,7 @@
                 <w:b w:val="0"/>
                 <w:sz w:val="18"/>
               </w:rPr>
-              <w:t>Mọi truy vấn và thao tác thành viên, preset, hội thoại, bài viết được ràng buộc với workspace hiện hành.</w:t>
+              <w:t>Mọi truy vấn và thao tác thành viên, mẫu giọng văn, hội thoại và bài viết đều được ràng buộc với không gian làm việc hiện hành.</w:t>
             </w:r>
           </w:p>
         </w:tc>
@@ -4741,7 +5548,7 @@
                 <w:b w:val="0"/>
                 <w:sz w:val="18"/>
               </w:rPr>
-              <w:t>Audit</w:t>
+              <w:t>Nhật ký kiểm toán</w:t>
             </w:r>
           </w:p>
         </w:tc>
@@ -4768,7 +5575,7 @@
                 <w:b w:val="0"/>
                 <w:sz w:val="18"/>
               </w:rPr>
-              <w:t>Ghi người thực hiện, hành động, thời điểm, model run, công cụ được duyệt, lỗi và phiên bản nội dung.</w:t>
+              <w:t>Ghi người thực hiện, hành động, thời điểm, từng lần dùng mô hình AI, công cụ đã được cho phép, lỗi và phiên bản nội dung.</w:t>
             </w:r>
           </w:p>
         </w:tc>
@@ -4918,7 +5725,7 @@
     </w:p>
     <w:p>
       <w:r>
-        <w:t>Sản phẩm đã có giao diện vận hành end-to-end cho nguồn, scan, bằng chứng, phân tích, chủ đề, bản nháp, chat, bài viết, Zalo OA, báo cáo, thành viên, cài đặt và nhật ký. Các luồng rủi ro cao như xuất bản Zalo được tách thành nhiều bước và đặt sau xác nhận của người dùng.</w:t>
+        <w:t>Sản phẩm đã có luồng làm việc xuyên suốt từ nguồn tin, quét dữ liệu, bằng chứng, phân tích và chủ đề đến bản nháp, trò chuyện AI, bài viết, Zalo OA, báo cáo, thành viên, cài đặt và nhật ký. Những thao tác có rủi ro cao, đặc biệt là xuất bản lên Zalo, được tách thành nhiều bước rõ ràng và chỉ tiếp tục sau khi người dùng xác nhận.</w:t>
       </w:r>
     </w:p>
     <w:tbl>
@@ -5102,7 +5909,7 @@
                 <w:b w:val="0"/>
                 <w:sz w:val="18"/>
               </w:rPr>
-              <w:t>Scan ngay/xếp hàng, rescan, tiến độ, retry và chống trùng theo request.</w:t>
+              <w:t>Quét ngay/xếp hàng, quét lại có liên kết, theo dõi tiến độ, thử lại và chống gửi trùng.</w:t>
             </w:r>
           </w:p>
         </w:tc>
@@ -5440,7 +6247,7 @@
                 <w:b w:val="0"/>
                 <w:sz w:val="18"/>
               </w:rPr>
-              <w:t>Tạo tự động từ scan, hai mức độ phân tích, tóm tắt điều hành, phát hiện, khuyến nghị, giới hạn và xuất đa định dạng.</w:t>
+              <w:t>Tạo tự động từ lần quét, có hai mức độ phân tích, tóm tắt điều hành, phát hiện, khuyến nghị, giới hạn và xuất đa định dạng.</w:t>
             </w:r>
           </w:p>
         </w:tc>
@@ -5526,7 +6333,7 @@
                 <w:b w:val="0"/>
                 <w:sz w:val="18"/>
               </w:rPr>
-              <w:t>Worker, cron, heartbeat, retry hữu hạn và màn hình vận hành.</w:t>
+              <w:t>Tiến trình chạy nền, lịch chạy định kỳ, tín hiệu hoạt động, số lần thử lại có giới hạn và màn hình vận hành.</w:t>
             </w:r>
           </w:p>
         </w:tc>
@@ -5550,7 +6357,7 @@
         <w:pStyle w:val="ListBullet"/>
       </w:pPr>
       <w:r>
-        <w:t>Unit test cho schema báo cáo, làm sạch tiếng Việt, phân tách đoạn Zalo, logic rủi ro, retry ngữ cảnh, PKCE, mã hóa token, payload Zalo, xuất tệp và quyền công cụ.</w:t>
+        <w:t>Kiểm thử đơn vị cho cấu trúc báo cáo, làm sạch tiếng Việt, phân tách đoạn Zalo, logic rủi ro, thử lại với ngữ cảnh gọn hơn, PKCE, mã hóa token, dữ liệu gửi Zalo, xuất tệp và quyền dùng công cụ.</w:t>
       </w:r>
     </w:p>
     <w:p>
@@ -5558,7 +6365,7 @@
         <w:pStyle w:val="ListBullet"/>
       </w:pPr>
       <w:r>
-        <w:t>Integration test có mock cho OAuth/Article API; không đăng bài thật trong kiểm thử tự động.</w:t>
+        <w:t>Kiểm thử tích hợp dùng dịch vụ Zalo mô phỏng cho OAuth và Article API; kiểm thử tự động tuyệt đối không đăng bài thật.</w:t>
       </w:r>
     </w:p>
     <w:p>
@@ -5566,7 +6373,7 @@
         <w:pStyle w:val="ListBullet"/>
       </w:pPr>
       <w:r>
-        <w:t>Build production, lint khu vực thay đổi và kiểm tra TypeScript trước khi phát hành.</w:t>
+        <w:t>Tạo bản dựng dùng cho môi trường thật, kiểm tra quy tắc mã nguồn ở khu vực thay đổi và kiểm tra TypeScript trước khi phát hành.</w:t>
       </w:r>
     </w:p>
     <w:p>
@@ -5574,7 +6381,7 @@
         <w:pStyle w:val="ListBullet"/>
       </w:pPr>
       <w:r>
-        <w:t>Browser smoke test trên desktop/mobile: xác minh DOM, thao tác, trạng thái sau tải lại, console và ảnh chụp màn hình.</w:t>
+        <w:t>Kiểm tra nhanh bằng trình duyệt trên máy tính và điện thoại: xác minh nội dung hiển thị, thao tác, trạng thái sau khi tải lại, lỗi trong trình duyệt và ảnh chụp màn hình.</w:t>
       </w:r>
     </w:p>
     <w:p>
@@ -5638,7 +6445,7 @@
               <w:rPr>
                 <w:sz w:val="19"/>
               </w:rPr>
-              <w:t>Các kiểm thử phần mềm chứng minh luồng và ràng buộc kỹ thuật. Chỉ số hiệu quả thực địa như thời gian tiết kiệm, tỷ lệ phát hiện đúng hoặc mức độ hài lòng cần được đo trong một đợt pilot có tiêu chí và dữ liệu đối chứng; tài liệu này không tự suy diễn các con số đó.</w:t>
+              <w:t>Kiểm thử phần mềm cho thấy các luồng và ràng buộc kỹ thuật hoạt động đúng như thiết kế. Những chỉ số ngoài thực tế như thời gian tiết kiệm, tỷ lệ phát hiện đúng hay mức độ hài lòng phải được đo trong một giai đoạn thử nghiệm có tiêu chí và dữ liệu đối chứng; tài liệu này không tự đưa ra các con số chưa được kiểm chứng.</w:t>
             </w:r>
           </w:p>
         </w:tc>
@@ -5791,7 +6598,7 @@
                 <w:b w:val="0"/>
                 <w:sz w:val="18"/>
               </w:rPr>
-              <w:t>Kiến trúc web tiêu chuẩn, cơ sở dữ liệu quan hệ, API có schema, hàng đợi và nhà cung cấp AI thay thế được; có thể triển khai trên hạ tầng cloud phổ biến.</w:t>
+              <w:t>Kiến trúc web tiêu chuẩn, cơ sở dữ liệu quan hệ, API có cấu trúc kiểm tra rõ ràng, hàng đợi và dịch vụ AI có thể thay thế; phù hợp với hạ tầng đám mây phổ biến.</w:t>
             </w:r>
           </w:p>
         </w:tc>
@@ -5907,7 +6714,7 @@
                 <w:b w:val="0"/>
                 <w:sz w:val="18"/>
               </w:rPr>
-              <w:t>Tái sử dụng hạ tầng AI Tuturuuu và chỉ gửi ngữ cảnh cần thiết; hàng đợi, cache và retry có giới hạn giúp kiểm soát chi phí nhà cung cấp.</w:t>
+              <w:t>Tái sử dụng hạ tầng AI Tuturuuu và chỉ gửi phần ngữ cảnh cần thiết; bộ nhớ đệm và số lần thử lại có giới hạn giúp kiểm soát chi phí dịch vụ.</w:t>
             </w:r>
           </w:p>
         </w:tc>
@@ -5966,7 +6773,7 @@
                 <w:b w:val="0"/>
                 <w:sz w:val="18"/>
               </w:rPr>
-              <w:t>Tách nguồn, scan, bằng chứng, chủ đề, bài viết và publication job cho phép tăng số nguồn, OA và worker mà không đổi quy trình nghiệp vụ.</w:t>
+              <w:t>Nguồn, lần quét, bằng chứng, chủ đề, bài viết và công việc xuất bản được tách riêng, nhờ đó có thể tăng số nguồn, OA và tiến trình chạy nền mà không đổi quy trình nghiệp vụ.</w:t>
             </w:r>
           </w:p>
         </w:tc>
@@ -6023,7 +6830,7 @@
                 <w:b w:val="0"/>
                 <w:sz w:val="18"/>
               </w:rPr>
-              <w:t>API nội bộ có schema và audit; kiến trúc provider adapter cho phép thêm nguồn thu thập hoặc kênh phân phối trong tương lai.</w:t>
+              <w:t>API nội bộ có cấu trúc và nhật ký; lớp kết nối dịch vụ cho phép bổ sung nguồn thu thập hoặc kênh phân phối trong tương lai.</w:t>
             </w:r>
           </w:p>
         </w:tc>
@@ -6197,7 +7004,7 @@
                 <w:b w:val="0"/>
                 <w:sz w:val="18"/>
               </w:rPr>
-              <w:t>Thời gian trung vị từ scan đến bản nháp cần duyệt.</w:t>
+              <w:t>Thời gian trung vị từ lúc quét đến khi có bản nháp cần duyệt.</w:t>
             </w:r>
           </w:p>
         </w:tc>
@@ -6223,7 +7030,7 @@
                 <w:b w:val="0"/>
                 <w:sz w:val="18"/>
               </w:rPr>
-              <w:t>Sự kiện pipeline và timestamp phiên bản.</w:t>
+              <w:t>Mốc thời gian của từng bước và phiên bản nội dung.</w:t>
             </w:r>
           </w:p>
         </w:tc>
@@ -6282,7 +7089,7 @@
                 <w:b w:val="0"/>
                 <w:sz w:val="18"/>
               </w:rPr>
-              <w:t>Tỷ lệ bản nháp có bằng chứng và liên kết nguồn hợp lệ.</w:t>
+              <w:t>Tỷ lệ bản nháp có bằng chứng và đường dẫn nguồn hợp lệ.</w:t>
             </w:r>
           </w:p>
         </w:tc>
@@ -6309,7 +7116,7 @@
                 <w:b w:val="0"/>
                 <w:sz w:val="18"/>
               </w:rPr>
-              <w:t>Quan hệ draft–evidence và kiểm tra citation coverage.</w:t>
+              <w:t>Quan hệ giữa bản nháp và bằng chứng; mức độ bao phủ nguồn trích dẫn.</w:t>
             </w:r>
           </w:p>
         </w:tc>
@@ -6366,7 +7173,7 @@
                 <w:b w:val="0"/>
                 <w:sz w:val="18"/>
               </w:rPr>
-              <w:t>Tỷ lệ bản nháp được duyệt sau 0–1 vòng sửa; đánh giá người duyệt.</w:t>
+              <w:t>Tỷ lệ bản nháp được duyệt ngay hoặc chỉ cần một vòng sửa; đánh giá của người duyệt.</w:t>
             </w:r>
           </w:p>
         </w:tc>
@@ -6392,7 +7199,7 @@
                 <w:b w:val="0"/>
                 <w:sz w:val="18"/>
               </w:rPr>
-              <w:t>Lịch sử phiên bản và biểu mẫu pilot.</w:t>
+              <w:t>Lịch sử phiên bản và biểu mẫu trong giai đoạn thử nghiệm.</w:t>
             </w:r>
           </w:p>
         </w:tc>
@@ -6478,7 +7285,7 @@
                 <w:b w:val="0"/>
                 <w:sz w:val="18"/>
               </w:rPr>
-              <w:t>Audit event và đối soát Zalo.</w:t>
+              <w:t>Nhật ký thao tác và kết quả đối soát Zalo.</w:t>
             </w:r>
           </w:p>
         </w:tc>
@@ -6535,7 +7342,7 @@
                 <w:b w:val="0"/>
                 <w:sz w:val="18"/>
               </w:rPr>
-              <w:t>Tỷ lệ job thành công, thời gian hàng đợi, số retry.</w:t>
+              <w:t>Tỷ lệ công việc hoàn tất, thời gian chờ và số lần phải thử lại.</w:t>
             </w:r>
           </w:p>
         </w:tc>
@@ -6561,7 +7368,7 @@
                 <w:b w:val="0"/>
                 <w:sz w:val="18"/>
               </w:rPr>
-              <w:t>Dashboard vận hành và heartbeat.</w:t>
+              <w:t>Màn hình vận hành và tín hiệu hoạt động của hệ thống.</w:t>
             </w:r>
           </w:p>
         </w:tc>
@@ -6591,7 +7398,7 @@
         <w:t xml:space="preserve">Nguồn thay đổi hoặc chặn thu thập: </w:t>
       </w:r>
       <w:r>
-        <w:t>dùng nhiều provider, ghi lỗi theo lần chạy, cho phép nhập tay và rescan.</w:t>
+        <w:t>dùng nhiều dịch vụ thay thế, ghi lỗi theo từng lần chạy, cho phép nhập trực tiếp và quét lại.</w:t>
       </w:r>
     </w:p>
     <w:p>
@@ -6605,7 +7412,7 @@
         <w:t xml:space="preserve">AI suy diễn hoặc viết thiếu tự nhiên: </w:t>
       </w:r>
       <w:r>
-        <w:t>chỉ dùng bằng chứng, schema đầu ra, hướng dẫn tiếng Việt tập trung, nêu giới hạn, phiên bản và duyệt bắt buộc.</w:t>
+        <w:t>chỉ dùng bằng chứng, kiểm tra cấu trúc đầu ra, dùng hướng dẫn tiếng Việt thống nhất, nêu rõ giới hạn, lưu phiên bản và bắt buộc duyệt.</w:t>
       </w:r>
     </w:p>
     <w:p>
@@ -6616,10 +7423,10 @@
         <w:rPr>
           <w:b/>
         </w:rPr>
-        <w:t xml:space="preserve">API Zalo bất đồng bộ/không chắc chắn: </w:t>
+        <w:t xml:space="preserve">API Zalo xử lý bất đồng bộ hoặc trả kết quả chưa chắc chắn: </w:t>
       </w:r>
       <w:r>
-        <w:t>lưu operation token, đối soát trước retry, idempotency và mặc định nháp/ẩn.</w:t>
+        <w:t>lưu mã thao tác, đối soát trước khi thử lại, chống lặp và mặc định tạo bài nháp/ẩn.</w:t>
       </w:r>
     </w:p>
     <w:p>
@@ -6670,7 +7477,7 @@
         <w:t xml:space="preserve">1. </w:t>
       </w:r>
       <w:r>
-        <w:t>Pilot 2–4 tuần với một nhóm vận hành và một Zalo OA thử nghiệm; thống nhất bộ chỉ số trước khi bắt đầu.</w:t>
+        <w:t>Thử nghiệm thực tế trong 2–4 tuần với một nhóm vận hành và một Zalo OA dành riêng cho kiểm thử; thống nhất bộ chỉ số trước khi bắt đầu.</w:t>
       </w:r>
     </w:p>
     <w:p>
@@ -6685,7 +7492,7 @@
         <w:t xml:space="preserve">2. </w:t>
       </w:r>
       <w:r>
-        <w:t>Hiệu chỉnh prompt/preset tiếng Việt từ đánh giá người duyệt; không dùng nội dung nhạy cảm ngoài phạm vi cho phép.</w:t>
+        <w:t>Điều chỉnh hướng dẫn và mẫu giọng văn tiếng Việt từ đánh giá của người duyệt; không dùng nội dung nhạy cảm ngoài phạm vi cho phép.</w:t>
       </w:r>
     </w:p>
     <w:p>
@@ -6700,7 +7507,7 @@
         <w:t xml:space="preserve">3. </w:t>
       </w:r>
       <w:r>
-        <w:t>Mở rộng nguồn và dashboard chất lượng sau khi đạt ngưỡng ổn định về lỗi, thời gian xử lý và citation coverage.</w:t>
+        <w:t>Mở rộng nguồn và màn hình theo dõi chất lượng sau khi lỗi, thời gian xử lý và mức độ bao phủ nguồn đã ổn định.</w:t>
       </w:r>
     </w:p>
     <w:p>
@@ -7050,7 +7857,7 @@
                 <w:b w:val="0"/>
                 <w:sz w:val="18"/>
               </w:rPr>
-              <w:t>Mô hình evidence-first, quy trình 5 bước và điểm khác biệt.</w:t>
+              <w:t>Mô hình lấy bằng chứng làm điểm xuất phát, quy trình 5 bước và điểm khác biệt.</w:t>
             </w:r>
           </w:p>
         </w:tc>
@@ -7219,7 +8026,7 @@
                 <w:b w:val="0"/>
                 <w:sz w:val="18"/>
               </w:rPr>
-              <w:t>Stack, tích hợp, AI, luồng dữ liệu và hàng đợi.</w:t>
+              <w:t>Kiến trúc, ngăn xếp công nghệ, tích hợp AI, luồng dữ liệu, hàng đợi và các quyết định thiết kế.</w:t>
             </w:r>
           </w:p>
         </w:tc>
@@ -7304,7 +8111,7 @@
                 <w:b w:val="0"/>
                 <w:sz w:val="18"/>
               </w:rPr>
-              <w:t>Auth, workspace, mã hóa, OAuth, audit và duyệt.</w:t>
+              <w:t>Xác thực, phạm vi không gian làm việc, mã hóa, OAuth, nhật ký kiểm toán và phê duyệt.</w:t>
             </w:r>
           </w:p>
         </w:tc>
@@ -7679,7 +8486,7 @@
                 <w:b w:val="0"/>
                 <w:sz w:val="18"/>
               </w:rPr>
-              <w:t>Mở Nguồn &amp; Quét, tạo scan “Xử lý ngay”.</w:t>
+              <w:t>Mở Nguồn &amp; Quét, tạo một lần quét bằng nút “Xử lý ngay”.</w:t>
             </w:r>
           </w:p>
         </w:tc>
@@ -8503,7 +9310,7 @@
               <w:rPr>
                 <w:sz w:val="19"/>
               </w:rPr>
-              <w:t>Một quy trình thống nhất giúp đội ngũ chuyển từ phản ứng rời rạc sang tác nghiệp có căn cứ, có kiểm soát và có thể đo lường.</w:t>
+              <w:t>CyberShield35 giúp đội ngũ không còn phải ghép nối thủ công giữa đường dẫn, ảnh chụp, bản nháp và bảng theo dõi. Mọi việc diễn ra trong một quy trình có căn cứ, có người chịu trách nhiệm và có số liệu để cải thiện sau mỗi giai đoạn vận hành.</w:t>
             </w:r>
           </w:p>
         </w:tc>

</xml_diff>